<commit_message>
Move the data swap from Lesson 5 to Lesson 6 and rebalance both lessons
Co-authored-by: Cursor <cursoragent@cursor.com>
</commit_message>
<xml_diff>
--- a/lessons/04-point-of-no-return/resources/l4-student-sheets-EDITABLE.docx
+++ b/lessons/04-point-of-no-return/resources/l4-student-sheets-EDITABLE.docx
@@ -1086,7 +1086,7 @@
           </w:tcPr>
           <w:p>
             <w:pPr>
-              <w:spacing w:after="85" w:before="85"/>
+              <w:spacing w:after="52" w:before="52"/>
             </w:pPr>
             <w:r>
               <w:rPr>
@@ -1119,7 +1119,7 @@
           </w:tcPr>
           <w:p>
             <w:pPr>
-              <w:spacing w:after="85" w:before="85"/>
+              <w:spacing w:after="52" w:before="52"/>
             </w:pPr>
             <w:r>
               <w:rPr>
@@ -1152,7 +1152,7 @@
           </w:tcPr>
           <w:p>
             <w:pPr>
-              <w:spacing w:after="85" w:before="85"/>
+              <w:spacing w:after="52" w:before="52"/>
             </w:pPr>
             <w:r>
               <w:rPr>
@@ -1169,7 +1169,7 @@
     </w:tbl>
     <w:p>
       <w:pPr>
-        <w:spacing w:after="120"/>
+        <w:spacing w:after="40"/>
       </w:pPr>
     </w:p>
     <w:p>
@@ -1440,7 +1440,7 @@
           </w:tcPr>
           <w:p>
             <w:pPr>
-              <w:spacing w:after="85" w:before="85"/>
+              <w:spacing w:after="52" w:before="52"/>
             </w:pPr>
             <w:r>
               <w:rPr>
@@ -1473,7 +1473,7 @@
           </w:tcPr>
           <w:p>
             <w:pPr>
-              <w:spacing w:after="85" w:before="85"/>
+              <w:spacing w:after="52" w:before="52"/>
             </w:pPr>
             <w:r>
               <w:rPr>
@@ -1506,7 +1506,7 @@
           </w:tcPr>
           <w:p>
             <w:pPr>
-              <w:spacing w:after="85" w:before="85"/>
+              <w:spacing w:after="52" w:before="52"/>
             </w:pPr>
             <w:r>
               <w:rPr>
@@ -1539,7 +1539,7 @@
           </w:tcPr>
           <w:p>
             <w:pPr>
-              <w:spacing w:after="85" w:before="85"/>
+              <w:spacing w:after="52" w:before="52"/>
             </w:pPr>
             <w:r>
               <w:rPr>
@@ -1556,14 +1556,107 @@
     </w:tbl>
     <w:p>
       <w:pPr>
-        <w:spacing w:after="120"/>
+        <w:spacing w:after="40"/>
       </w:pPr>
     </w:p>
     <w:p>
+      <w:pPr>
+        <w:spacing w:after="30" w:before="100" w:line="260"/>
+      </w:pPr>
       <w:r>
-        <w:br w:type="page"/>
+        <w:rPr>
+          <w:rFonts w:ascii="Calibri" w:cs="Calibri" w:eastAsia="Calibri" w:hAnsi="Calibri"/>
+          <w:b/>
+          <w:bCs/>
+          <w:color w:val="222222"/>
+          <w:sz w:val="19"/>
+          <w:szCs w:val="19"/>
+        </w:rPr>
+        <w:t xml:space="preserve">If you kept heating past stage 6, would you ever get sugar back? How do you know?</w:t>
       </w:r>
     </w:p>
+    <w:tbl>
+      <w:tblPr>
+        <w:tblW w:type="dxa" w:w="9600"/>
+        <w:tblBorders>
+          <w:top w:val="none" w:color="FFFFFF" w:sz="0"/>
+          <w:left w:val="none" w:color="FFFFFF" w:sz="0"/>
+          <w:bottom w:val="none" w:color="FFFFFF" w:sz="0"/>
+          <w:right w:val="none" w:color="FFFFFF" w:sz="0"/>
+          <w:insideH w:val="single" w:color="AEB4C2" w:sz="4"/>
+          <w:insideV w:val="none" w:color="FFFFFF" w:sz="0"/>
+        </w:tblBorders>
+      </w:tblPr>
+      <w:tblGrid>
+        <w:gridCol w:w="9600"/>
+      </w:tblGrid>
+      <w:tr>
+        <w:tc>
+          <w:tcPr>
+            <w:tcW w:type="dxa" w:w="9600"/>
+            <w:tcBorders>
+              <w:top w:val="none" w:color="FFFFFF" w:sz="0"/>
+              <w:left w:val="none" w:color="FFFFFF" w:sz="0"/>
+              <w:bottom w:val="single" w:color="AEB4C2" w:sz="4"/>
+              <w:right w:val="none" w:color="FFFFFF" w:sz="0"/>
+            </w:tcBorders>
+            <w:tcMar>
+              <w:top w:type="dxa" w:w="0"/>
+              <w:left w:type="dxa" w:w="0"/>
+              <w:bottom w:type="dxa" w:w="0"/>
+              <w:right w:type="dxa" w:w="0"/>
+            </w:tcMar>
+          </w:tcPr>
+          <w:p>
+            <w:pPr>
+              <w:spacing w:after="52" w:before="52"/>
+            </w:pPr>
+            <w:r>
+              <w:rPr>
+                <w:rFonts w:ascii="Calibri" w:cs="Calibri" w:eastAsia="Calibri" w:hAnsi="Calibri"/>
+                <w:color w:val="222222"/>
+                <w:sz w:val="20"/>
+                <w:szCs w:val="20"/>
+              </w:rPr>
+              <w:t xml:space="preserve"> </w:t>
+            </w:r>
+          </w:p>
+        </w:tc>
+      </w:tr>
+      <w:tr>
+        <w:tc>
+          <w:tcPr>
+            <w:tcW w:type="dxa" w:w="9600"/>
+            <w:tcBorders>
+              <w:top w:val="none" w:color="FFFFFF" w:sz="0"/>
+              <w:left w:val="none" w:color="FFFFFF" w:sz="0"/>
+              <w:bottom w:val="single" w:color="AEB4C2" w:sz="4"/>
+              <w:right w:val="none" w:color="FFFFFF" w:sz="0"/>
+            </w:tcBorders>
+            <w:tcMar>
+              <w:top w:type="dxa" w:w="0"/>
+              <w:left w:type="dxa" w:w="0"/>
+              <w:bottom w:type="dxa" w:w="0"/>
+              <w:right w:type="dxa" w:w="0"/>
+            </w:tcMar>
+          </w:tcPr>
+          <w:p>
+            <w:pPr>
+              <w:spacing w:after="52" w:before="52"/>
+            </w:pPr>
+            <w:r>
+              <w:rPr>
+                <w:rFonts w:ascii="Calibri" w:cs="Calibri" w:eastAsia="Calibri" w:hAnsi="Calibri"/>
+                <w:color w:val="222222"/>
+                <w:sz w:val="20"/>
+                <w:szCs w:val="20"/>
+              </w:rPr>
+              <w:t xml:space="preserve"> </w:t>
+            </w:r>
+          </w:p>
+        </w:tc>
+      </w:tr>
+    </w:tbl>
     <w:p>
       <w:pPr>
         <w:spacing w:after="30" w:before="40" w:line="260"/>
@@ -1578,6 +1671,38 @@
           <w:szCs w:val="17"/>
         </w:rPr>
         <w:t xml:space="preserve">YEAR 6 SCIENCE · LESSON 4</w:t>
+      </w:r>
+    </w:p>
+    <w:p>
+      <w:pPr>
+        <w:pBdr>
+          <w:top w:val="single" w:color="E4E0D6" w:sz="2" w:space="6"/>
+          <w:bottom w:val="single" w:color="E4E0D6" w:sz="2" w:space="6"/>
+          <w:left w:val="single" w:color="E8930C" w:sz="18" w:space="8"/>
+          <w:right w:val="single" w:color="E4E0D6" w:sz="2" w:space="6"/>
+        </w:pBdr>
+        <w:shd w:fill="FBF9F4" w:val="clear"/>
+        <w:spacing w:after="130" w:before="130" w:line="265"/>
+      </w:pPr>
+      <w:r>
+        <w:rPr>
+          <w:rFonts w:ascii="Calibri" w:cs="Calibri" w:eastAsia="Calibri" w:hAnsi="Calibri"/>
+          <w:b/>
+          <w:bCs/>
+          <w:color w:val="9A5F00"/>
+          <w:sz w:val="19"/>
+          <w:szCs w:val="19"/>
+        </w:rPr>
+        <w:t xml:space="preserve">Push me  </w:t>
+      </w:r>
+      <w:r>
+        <w:rPr>
+          <w:rFonts w:ascii="Calibri" w:cs="Calibri" w:eastAsia="Calibri" w:hAnsi="Calibri"/>
+          <w:color w:val="222222"/>
+          <w:sz w:val="19"/>
+          <w:szCs w:val="19"/>
+        </w:rPr>
+        <w:t xml:space="preserve">Argue that the sugar transition happened one stage EARLIER or LATER than the class agreed — and defend it with evidence. What would have settled the argument?</w:t>
       </w:r>
     </w:p>
     <w:p>
@@ -2027,7 +2152,7 @@
           </w:tcPr>
           <w:p>
             <w:pPr>
-              <w:spacing w:after="85" w:before="85"/>
+              <w:spacing w:after="52" w:before="52"/>
             </w:pPr>
             <w:r>
               <w:rPr>
@@ -2044,7 +2169,7 @@
     </w:tbl>
     <w:p>
       <w:pPr>
-        <w:spacing w:after="120"/>
+        <w:spacing w:after="40"/>
       </w:pPr>
     </w:p>
     <w:p>
@@ -2100,7 +2225,7 @@
           </w:tcPr>
           <w:p>
             <w:pPr>
-              <w:spacing w:after="85" w:before="85"/>
+              <w:spacing w:after="52" w:before="52"/>
             </w:pPr>
             <w:r>
               <w:rPr>
@@ -2117,7 +2242,7 @@
     </w:tbl>
     <w:p>
       <w:pPr>
-        <w:spacing w:after="120"/>
+        <w:spacing w:after="40"/>
       </w:pPr>
     </w:p>
     <w:p>
@@ -2173,7 +2298,7 @@
           </w:tcPr>
           <w:p>
             <w:pPr>
-              <w:spacing w:after="85" w:before="85"/>
+              <w:spacing w:after="52" w:before="52"/>
             </w:pPr>
             <w:r>
               <w:rPr>
@@ -2206,7 +2331,7 @@
           </w:tcPr>
           <w:p>
             <w:pPr>
-              <w:spacing w:after="85" w:before="85"/>
+              <w:spacing w:after="52" w:before="52"/>
             </w:pPr>
             <w:r>
               <w:rPr>
@@ -2239,7 +2364,7 @@
           </w:tcPr>
           <w:p>
             <w:pPr>
-              <w:spacing w:after="85" w:before="85"/>
+              <w:spacing w:after="52" w:before="52"/>
             </w:pPr>
             <w:r>
               <w:rPr>
@@ -2272,7 +2397,7 @@
           </w:tcPr>
           <w:p>
             <w:pPr>
-              <w:spacing w:after="85" w:before="85"/>
+              <w:spacing w:after="52" w:before="52"/>
             </w:pPr>
             <w:r>
               <w:rPr>
@@ -2289,7 +2414,7 @@
     </w:tbl>
     <w:p>
       <w:pPr>
-        <w:spacing w:after="120"/>
+        <w:spacing w:after="40"/>
       </w:pPr>
     </w:p>
     <w:p>
@@ -2345,7 +2470,7 @@
           </w:tcPr>
           <w:p>
             <w:pPr>
-              <w:spacing w:after="85" w:before="85"/>
+              <w:spacing w:after="52" w:before="52"/>
             </w:pPr>
             <w:r>
               <w:rPr>
@@ -2378,7 +2503,7 @@
           </w:tcPr>
           <w:p>
             <w:pPr>
-              <w:spacing w:after="85" w:before="85"/>
+              <w:spacing w:after="52" w:before="52"/>
             </w:pPr>
             <w:r>
               <w:rPr>
@@ -2411,7 +2536,7 @@
           </w:tcPr>
           <w:p>
             <w:pPr>
-              <w:spacing w:after="85" w:before="85"/>
+              <w:spacing w:after="52" w:before="52"/>
             </w:pPr>
             <w:r>
               <w:rPr>
@@ -2444,7 +2569,7 @@
           </w:tcPr>
           <w:p>
             <w:pPr>
-              <w:spacing w:after="85" w:before="85"/>
+              <w:spacing w:after="52" w:before="52"/>
             </w:pPr>
             <w:r>
               <w:rPr>
@@ -2461,7 +2586,7 @@
     </w:tbl>
     <w:p>
       <w:pPr>
-        <w:spacing w:after="120"/>
+        <w:spacing w:after="40"/>
       </w:pPr>
     </w:p>
     <w:p>
@@ -2562,7 +2687,7 @@
           </w:tcPr>
           <w:p>
             <w:pPr>
-              <w:spacing w:after="85" w:before="85"/>
+              <w:spacing w:after="52" w:before="52"/>
             </w:pPr>
             <w:r>
               <w:rPr>
@@ -2595,7 +2720,7 @@
           </w:tcPr>
           <w:p>
             <w:pPr>
-              <w:spacing w:after="85" w:before="85"/>
+              <w:spacing w:after="52" w:before="52"/>
             </w:pPr>
             <w:r>
               <w:rPr>
@@ -2609,110 +2734,7 @@
           </w:p>
         </w:tc>
       </w:tr>
-      <w:tr>
-        <w:tc>
-          <w:tcPr>
-            <w:tcW w:type="dxa" w:w="9600"/>
-            <w:tcBorders>
-              <w:top w:val="none" w:color="FFFFFF" w:sz="0"/>
-              <w:left w:val="none" w:color="FFFFFF" w:sz="0"/>
-              <w:bottom w:val="single" w:color="AEB4C2" w:sz="4"/>
-              <w:right w:val="none" w:color="FFFFFF" w:sz="0"/>
-            </w:tcBorders>
-            <w:tcMar>
-              <w:top w:type="dxa" w:w="0"/>
-              <w:left w:type="dxa" w:w="0"/>
-              <w:bottom w:type="dxa" w:w="0"/>
-              <w:right w:type="dxa" w:w="0"/>
-            </w:tcMar>
-          </w:tcPr>
-          <w:p>
-            <w:pPr>
-              <w:spacing w:after="85" w:before="85"/>
-            </w:pPr>
-            <w:r>
-              <w:rPr>
-                <w:rFonts w:ascii="Calibri" w:cs="Calibri" w:eastAsia="Calibri" w:hAnsi="Calibri"/>
-                <w:color w:val="222222"/>
-                <w:sz w:val="20"/>
-                <w:szCs w:val="20"/>
-              </w:rPr>
-              <w:t xml:space="preserve"> </w:t>
-            </w:r>
-          </w:p>
-        </w:tc>
-      </w:tr>
-      <w:tr>
-        <w:tc>
-          <w:tcPr>
-            <w:tcW w:type="dxa" w:w="9600"/>
-            <w:tcBorders>
-              <w:top w:val="none" w:color="FFFFFF" w:sz="0"/>
-              <w:left w:val="none" w:color="FFFFFF" w:sz="0"/>
-              <w:bottom w:val="single" w:color="AEB4C2" w:sz="4"/>
-              <w:right w:val="none" w:color="FFFFFF" w:sz="0"/>
-            </w:tcBorders>
-            <w:tcMar>
-              <w:top w:type="dxa" w:w="0"/>
-              <w:left w:type="dxa" w:w="0"/>
-              <w:bottom w:type="dxa" w:w="0"/>
-              <w:right w:type="dxa" w:w="0"/>
-            </w:tcMar>
-          </w:tcPr>
-          <w:p>
-            <w:pPr>
-              <w:spacing w:after="85" w:before="85"/>
-            </w:pPr>
-            <w:r>
-              <w:rPr>
-                <w:rFonts w:ascii="Calibri" w:cs="Calibri" w:eastAsia="Calibri" w:hAnsi="Calibri"/>
-                <w:color w:val="222222"/>
-                <w:sz w:val="20"/>
-                <w:szCs w:val="20"/>
-              </w:rPr>
-              <w:t xml:space="preserve"> </w:t>
-            </w:r>
-          </w:p>
-        </w:tc>
-      </w:tr>
     </w:tbl>
-    <w:p>
-      <w:pPr>
-        <w:spacing w:after="120"/>
-      </w:pPr>
-    </w:p>
-    <w:p>
-      <w:pPr>
-        <w:pBdr>
-          <w:top w:val="single" w:color="E4E0D6" w:sz="2" w:space="6"/>
-          <w:bottom w:val="single" w:color="E4E0D6" w:sz="2" w:space="6"/>
-          <w:left w:val="single" w:color="E8930C" w:sz="18" w:space="8"/>
-          <w:right w:val="single" w:color="E4E0D6" w:sz="2" w:space="6"/>
-        </w:pBdr>
-        <w:shd w:fill="FBF9F4" w:val="clear"/>
-        <w:spacing w:after="130" w:before="130" w:line="265"/>
-      </w:pPr>
-      <w:r>
-        <w:rPr>
-          <w:rFonts w:ascii="Calibri" w:cs="Calibri" w:eastAsia="Calibri" w:hAnsi="Calibri"/>
-          <w:b/>
-          <w:bCs/>
-          <w:color w:val="9A5F00"/>
-          <w:sz w:val="19"/>
-          <w:szCs w:val="19"/>
-        </w:rPr>
-        <w:t xml:space="preserve">Push me  </w:t>
-      </w:r>
-      <w:r>
-        <w:rPr>
-          <w:rFonts w:ascii="Calibri" w:cs="Calibri" w:eastAsia="Calibri" w:hAnsi="Calibri"/>
-          <w:color w:val="222222"/>
-          <w:sz w:val="19"/>
-          <w:szCs w:val="19"/>
-        </w:rPr>
-        <w:t xml:space="preserve">Argue that the sugar transition happened one stage EARLIER or LATER than the class agreed — and defend it with evidence. What would have settled the argument?</w:t>
-      </w:r>
-    </w:p>
     <w:p>
       <w:r>
         <w:br w:type="page"/>

</xml_diff>